<commit_message>
Fix Plea of Guilty template: replace hardcoded case data with placeholders
- Replaced hardcoded case number (703843256) with {{case_number}}
- Replaced hardcoded charge text with {{charge}}
- Split duplicate {{fine_amount}} into {{fine_amount}} and {{court_costs}}
- Replaced hardcoded attorney (D. Christopher LaPee #63013) with
  {{attorney_name}} {{attorney_bar}}
- Fixed gendered pronoun: "her rights" -> "his/her rights"
- Updated DOCUMENT_TYPES to include charge, fine_amount, court_costs
  as required variables

Co-Authored-By: Claude Opus 4.6 <noreply@anthropic.com>
</commit_message>
<xml_diff>
--- a/data/templates/Plea_of_Guilty.docx
+++ b/data/templates/Plea_of_Guilty.docx
@@ -218,7 +218,7 @@
           <w:sz w:val="26"/>
           <w:szCs w:val="26"/>
         </w:rPr>
-        <w:t>703843256</w:t>
+        <w:t>{{case_number}}</w:t>
       </w:r>
     </w:p>
     <w:p>
@@ -491,7 +491,7 @@
           <w:szCs w:val="26"/>
         </w:rPr>
         <w:tab/>
-        <w:t xml:space="preserve">{{defendant_name}} Defendant, by and through counsel, {{attorney_name}}, and enters a plea of guilty to the amended charge of Exceeded Posted Speed Limit (Exceeded by 1 – 5 MPH) , for a fine of {{fine_amount}} plus {{fine_amount}} court costs. </w:t>
+        <w:t xml:space="preserve">{{defendant_name}} Defendant, by and through counsel, {{attorney_name}}, and enters a plea of guilty to the amended charge of {{charge}}, for a fine of {{fine_amount}} plus {{court_costs}} court costs. </w:t>
       </w:r>
       <w:r>
         <w:rPr>
@@ -591,7 +591,7 @@
           <w:sz w:val="26"/>
           <w:szCs w:val="26"/>
         </w:rPr>
-        <w:t>efendant with full understanding of the nature of the charge and range of punishment. The Defendant has been advised of h</w:t>
+        <w:t>efendant with full understanding of the nature of the charge and range of punishment. The Defendant has been advised of his/h</w:t>
       </w:r>
       <w:r>
         <w:rPr>
@@ -1025,16 +1025,16 @@
           <w:sz w:val="26"/>
           <w:szCs w:val="26"/>
         </w:rPr>
-        <w:t xml:space="preserve">D. Christopher LaPee </w:t>
-      </w:r>
-      <w:r>
-        <w:rPr>
-          <w:rFonts w:ascii="Times New Roman" w:hAnsi="Times New Roman" w:cs="Times New Roman"/>
-          <w:sz w:val="26"/>
-          <w:szCs w:val="26"/>
-        </w:rPr>
-        <w:tab/>
-        <w:t>#63013</w:t>
+        <w:t xml:space="preserve">{{attorney_name}} </w:t>
+      </w:r>
+      <w:r>
+        <w:rPr>
+          <w:rFonts w:ascii="Times New Roman" w:hAnsi="Times New Roman" w:cs="Times New Roman"/>
+          <w:sz w:val="26"/>
+          <w:szCs w:val="26"/>
+        </w:rPr>
+        <w:tab/>
+        <w:t>{{attorney_bar}}</w:t>
       </w:r>
     </w:p>
     <w:p>

</xml_diff>

<commit_message>
Fix paragraph spacing in Plea of Guilty template
Add spacing (after=200) between caption, title, plea paragraph,
and Court findings paragraph to prevent text running together.

Co-Authored-By: Claude Opus 4.6 <noreply@anthropic.com>
</commit_message>
<xml_diff>
--- a/data/templates/Plea_of_Guilty.docx
+++ b/data/templates/Plea_of_Guilty.docx
@@ -379,6 +379,7 @@
           <w:sz w:val="26"/>
           <w:szCs w:val="26"/>
         </w:rPr>
+        <w:spacing w:after="200"/>
       </w:pPr>
       <w:r>
         <w:rPr>
@@ -430,7 +431,7 @@
     </w:p>
     <w:p>
       <w:pPr>
-        <w:spacing w:after="0"/>
+        <w:spacing w:after="200"/>
         <w:jc w:val="center"/>
         <w:rPr>
           <w:rFonts w:ascii="Times New Roman" w:hAnsi="Times New Roman" w:cs="Times New Roman"/>
@@ -561,7 +562,7 @@
     </w:p>
     <w:p>
       <w:pPr>
-        <w:spacing w:after="0"/>
+        <w:spacing w:after="200"/>
         <w:rPr>
           <w:rFonts w:ascii="Times New Roman" w:hAnsi="Times New Roman" w:cs="Times New Roman"/>
           <w:sz w:val="26"/>

</xml_diff>